<commit_message>
Updated Project Report with task 2 report
</commit_message>
<xml_diff>
--- a/Project_report.docx
+++ b/Project_report.docx
@@ -352,6 +352,79 @@
           <w:rFonts w:ascii="Arial" w:hAnsi="Arial" w:cs="Arial"/>
         </w:rPr>
       </w:pPr>
+    </w:p>
+    <w:p>
+      <w:pPr>
+        <w:rPr>
+          <w:rFonts w:ascii="Arial" w:hAnsi="Arial" w:cs="Arial"/>
+          <w:sz w:val="40"/>
+          <w:szCs w:val="40"/>
+        </w:rPr>
+      </w:pPr>
+      <w:r>
+        <w:rPr>
+          <w:rFonts w:ascii="Arial" w:hAnsi="Arial" w:cs="Arial"/>
+          <w:b/>
+          <w:bCs/>
+          <w:sz w:val="40"/>
+          <w:szCs w:val="40"/>
+        </w:rPr>
+        <w:t>Task 2: Portfolio Setup</w:t>
+      </w:r>
+      <w:r>
+        <w:rPr>
+          <w:rFonts w:ascii="Arial" w:hAnsi="Arial" w:cs="Arial"/>
+          <w:sz w:val="40"/>
+          <w:szCs w:val="40"/>
+        </w:rPr>
+        <w:t xml:space="preserve"> </w:t>
+      </w:r>
+    </w:p>
+    <w:p>
+      <w:pPr>
+        <w:rPr>
+          <w:rFonts w:ascii="Arial" w:hAnsi="Arial" w:cs="Arial"/>
+          <w:sz w:val="36"/>
+          <w:szCs w:val="36"/>
+        </w:rPr>
+      </w:pPr>
+      <w:r>
+        <w:rPr>
+          <w:rFonts w:ascii="Arial" w:hAnsi="Arial" w:cs="Arial"/>
+          <w:sz w:val="36"/>
+          <w:szCs w:val="36"/>
+        </w:rPr>
+        <w:t xml:space="preserve">For Task 2, I established my professional digital presence across three foundational platforms: GitHub, LinkedIn, and Stack Overflow. I chose GitHub because it is the industry standard for version control and collaborative development. Over the next four years, I plan to use it as a living portfolio to showcase my C++ Data Structures and Algorithms progress, Python automation scripts, and full-stack web applications using React and Next.js. LinkedIn is essential for professional networking and personal branding. I will use it to connect with industry professionals and peers, while formally documenting my </w:t>
+      </w:r>
+      <w:proofErr w:type="spellStart"/>
+      <w:proofErr w:type="gramStart"/>
+      <w:r>
+        <w:rPr>
+          <w:rFonts w:ascii="Arial" w:hAnsi="Arial" w:cs="Arial"/>
+          <w:sz w:val="36"/>
+          <w:szCs w:val="36"/>
+        </w:rPr>
+        <w:t>B.Tech</w:t>
+      </w:r>
+      <w:proofErr w:type="spellEnd"/>
+      <w:proofErr w:type="gramEnd"/>
+      <w:r>
+        <w:rPr>
+          <w:rFonts w:ascii="Arial" w:hAnsi="Arial" w:cs="Arial"/>
+          <w:sz w:val="36"/>
+          <w:szCs w:val="36"/>
+        </w:rPr>
+        <w:t xml:space="preserve"> journey at VIT </w:t>
+      </w:r>
+      <w:r>
+        <w:rPr>
+          <w:rFonts w:ascii="Arial" w:hAnsi="Arial" w:cs="Arial"/>
+          <w:sz w:val="36"/>
+          <w:szCs w:val="36"/>
+        </w:rPr>
+        <w:lastRenderedPageBreak/>
+        <w:t>Bhopal, including my graduation timeline (2025–2029), hackathon participations, and future internships. Finally, I selected Stack Overflow, a community-driven Q&amp;A platform. Rather than just consuming answers when debugging code for my web or Arduino hardware projects, my goal over my degree is to actively participate. I plan to ask well-structured questions when tackling complex MVPs and eventually contribute solutions to help other developers. Together, these platforms build a comprehensive snapshot of my technical growth.</w:t>
+      </w:r>
     </w:p>
     <w:p>
       <w:pPr>
@@ -973,7 +1046,6 @@
   <w:style w:type="character" w:default="1" w:styleId="DefaultParagraphFont">
     <w:name w:val="Default Paragraph Font"/>
     <w:uiPriority w:val="1"/>
-    <w:semiHidden/>
     <w:unhideWhenUsed/>
   </w:style>
   <w:style w:type="table" w:default="1" w:styleId="TableNormal">

</xml_diff>

<commit_message>
Updated project report with task 3 report
</commit_message>
<xml_diff>
--- a/Project_report.docx
+++ b/Project_report.docx
@@ -93,12 +93,9 @@
           <w:sz w:val="48"/>
           <w:szCs w:val="48"/>
         </w:rPr>
-        <w:t>Student Digital Ambassador Project Report</w:t>
-      </w:r>
-    </w:p>
-    <w:p>
-      <w:pPr>
-        <w:jc w:val="center"/>
+        <w:t>Digital Literacy</w:t>
+      </w:r>
+      <w:r>
         <w:rPr>
           <w:rFonts w:ascii="Arial" w:hAnsi="Arial" w:cs="Arial"/>
           <w:b/>
@@ -106,6 +103,19 @@
           <w:sz w:val="48"/>
           <w:szCs w:val="48"/>
         </w:rPr>
+        <w:t xml:space="preserve"> Project Report</w:t>
+      </w:r>
+    </w:p>
+    <w:p>
+      <w:pPr>
+        <w:jc w:val="center"/>
+        <w:rPr>
+          <w:rFonts w:ascii="Arial" w:hAnsi="Arial" w:cs="Arial"/>
+          <w:b/>
+          <w:bCs/>
+          <w:sz w:val="48"/>
+          <w:szCs w:val="48"/>
+        </w:rPr>
       </w:pPr>
     </w:p>
     <w:p>
@@ -424,6 +434,128 @@
         </w:rPr>
         <w:lastRenderedPageBreak/>
         <w:t>Bhopal, including my graduation timeline (2025–2029), hackathon participations, and future internships. Finally, I selected Stack Overflow, a community-driven Q&amp;A platform. Rather than just consuming answers when debugging code for my web or Arduino hardware projects, my goal over my degree is to actively participate. I plan to ask well-structured questions when tackling complex MVPs and eventually contribute solutions to help other developers. Together, these platforms build a comprehensive snapshot of my technical growth.</w:t>
+      </w:r>
+    </w:p>
+    <w:p>
+      <w:pPr>
+        <w:rPr>
+          <w:rFonts w:ascii="Arial" w:hAnsi="Arial" w:cs="Arial"/>
+        </w:rPr>
+      </w:pPr>
+    </w:p>
+    <w:p>
+      <w:pPr>
+        <w:rPr>
+          <w:rFonts w:ascii="Arial" w:hAnsi="Arial" w:cs="Arial"/>
+          <w:sz w:val="40"/>
+          <w:szCs w:val="40"/>
+        </w:rPr>
+      </w:pPr>
+      <w:r>
+        <w:rPr>
+          <w:rFonts w:ascii="Arial" w:hAnsi="Arial" w:cs="Arial"/>
+          <w:b/>
+          <w:bCs/>
+          <w:sz w:val="40"/>
+          <w:szCs w:val="40"/>
+        </w:rPr>
+        <w:t>Task 3: Platforms Activity</w:t>
+      </w:r>
+      <w:r>
+        <w:rPr>
+          <w:rFonts w:ascii="Arial" w:hAnsi="Arial" w:cs="Arial"/>
+          <w:sz w:val="40"/>
+          <w:szCs w:val="40"/>
+        </w:rPr>
+        <w:t xml:space="preserve"> </w:t>
+      </w:r>
+    </w:p>
+    <w:p>
+      <w:pPr>
+        <w:rPr>
+          <w:rFonts w:ascii="Arial" w:hAnsi="Arial" w:cs="Arial"/>
+          <w:sz w:val="36"/>
+          <w:szCs w:val="36"/>
+        </w:rPr>
+      </w:pPr>
+      <w:r>
+        <w:rPr>
+          <w:rFonts w:ascii="Arial" w:hAnsi="Arial" w:cs="Arial"/>
+          <w:sz w:val="36"/>
+          <w:szCs w:val="36"/>
+        </w:rPr>
+        <w:t xml:space="preserve">For Task 3, I utilized </w:t>
+      </w:r>
+      <w:proofErr w:type="spellStart"/>
+      <w:r>
+        <w:rPr>
+          <w:rFonts w:ascii="Arial" w:hAnsi="Arial" w:cs="Arial"/>
+          <w:sz w:val="36"/>
+          <w:szCs w:val="36"/>
+        </w:rPr>
+        <w:t>CodeChef</w:t>
+      </w:r>
+      <w:proofErr w:type="spellEnd"/>
+      <w:r>
+        <w:rPr>
+          <w:rFonts w:ascii="Arial" w:hAnsi="Arial" w:cs="Arial"/>
+          <w:sz w:val="36"/>
+          <w:szCs w:val="36"/>
+        </w:rPr>
+        <w:t xml:space="preserve"> for coding practice and Google Workspace for cloud collaboration. In Part A, I completed the C++ Online Test and Quiz on </w:t>
+      </w:r>
+      <w:proofErr w:type="spellStart"/>
+      <w:r>
+        <w:rPr>
+          <w:rFonts w:ascii="Arial" w:hAnsi="Arial" w:cs="Arial"/>
+          <w:sz w:val="36"/>
+          <w:szCs w:val="36"/>
+        </w:rPr>
+        <w:t>CodeChef</w:t>
+      </w:r>
+      <w:proofErr w:type="spellEnd"/>
+      <w:r>
+        <w:rPr>
+          <w:rFonts w:ascii="Arial" w:hAnsi="Arial" w:cs="Arial"/>
+          <w:sz w:val="36"/>
+          <w:szCs w:val="36"/>
+        </w:rPr>
+        <w:t>, successfully scoring 100% (2900/2900 points). This platform is highly beneficial for my academics as a Computer Science student, as it rigorously tests my core understanding of C++ and sharpens my algorithmic problem-solving skills for future Data Structures and Algorithms (DSA) coursework.</w:t>
+      </w:r>
+    </w:p>
+    <w:p>
+      <w:pPr>
+        <w:rPr>
+          <w:rFonts w:ascii="Arial" w:hAnsi="Arial" w:cs="Arial"/>
+          <w:sz w:val="36"/>
+          <w:szCs w:val="36"/>
+        </w:rPr>
+      </w:pPr>
+      <w:r>
+        <w:rPr>
+          <w:rFonts w:ascii="Arial" w:hAnsi="Arial" w:cs="Arial"/>
+          <w:sz w:val="36"/>
+          <w:szCs w:val="36"/>
+        </w:rPr>
+        <w:t xml:space="preserve">For Part B, I used Google Forms to build a 5-question 'Digital Literacy Awareness Quiz.' It incorporated both multiple-choice and short-answer formats to test basic cybersecurity and digital etiquette concepts. I then linked this form to a Google Sheet to automatically track and </w:t>
+      </w:r>
+      <w:proofErr w:type="spellStart"/>
+      <w:r>
+        <w:rPr>
+          <w:rFonts w:ascii="Arial" w:hAnsi="Arial" w:cs="Arial"/>
+          <w:sz w:val="36"/>
+          <w:szCs w:val="36"/>
+        </w:rPr>
+        <w:t>analyze</w:t>
+      </w:r>
+      <w:proofErr w:type="spellEnd"/>
+      <w:r>
+        <w:rPr>
+          <w:rFonts w:ascii="Arial" w:hAnsi="Arial" w:cs="Arial"/>
+          <w:sz w:val="36"/>
+          <w:szCs w:val="36"/>
+        </w:rPr>
+        <w:t xml:space="preserve"> the timestamped responses from my peers. Google Workspace tools like these are invaluable for my university journey. They streamline data collection for academic surveys, simplify group project coordination, and provide an efficient, real-time way to collaborate remotely with my batchmates on assignments.</w:t>
       </w:r>
     </w:p>
     <w:p>

</xml_diff>

<commit_message>
updated project report with task 4 and task 5 report
</commit_message>
<xml_diff>
--- a/Project_report.docx
+++ b/Project_report.docx
@@ -556,6 +556,139 @@
           <w:szCs w:val="36"/>
         </w:rPr>
         <w:t xml:space="preserve"> the timestamped responses from my peers. Google Workspace tools like these are invaluable for my university journey. They streamline data collection for academic surveys, simplify group project coordination, and provide an efficient, real-time way to collaborate remotely with my batchmates on assignments.</w:t>
+      </w:r>
+    </w:p>
+    <w:p>
+      <w:pPr>
+        <w:rPr>
+          <w:rFonts w:ascii="Arial" w:hAnsi="Arial" w:cs="Arial"/>
+        </w:rPr>
+      </w:pPr>
+    </w:p>
+    <w:p>
+      <w:pPr>
+        <w:rPr>
+          <w:rFonts w:ascii="Arial" w:hAnsi="Arial" w:cs="Arial"/>
+          <w:b/>
+          <w:bCs/>
+          <w:sz w:val="40"/>
+          <w:szCs w:val="40"/>
+        </w:rPr>
+      </w:pPr>
+      <w:r>
+        <w:rPr>
+          <w:rFonts w:ascii="Arial" w:hAnsi="Arial" w:cs="Arial"/>
+          <w:b/>
+          <w:bCs/>
+          <w:sz w:val="40"/>
+          <w:szCs w:val="40"/>
+        </w:rPr>
+        <w:lastRenderedPageBreak/>
+        <w:t>Task 4: Email Etiquette</w:t>
+      </w:r>
+    </w:p>
+    <w:p>
+      <w:pPr>
+        <w:rPr>
+          <w:rFonts w:ascii="Arial" w:hAnsi="Arial" w:cs="Arial"/>
+          <w:sz w:val="36"/>
+          <w:szCs w:val="36"/>
+        </w:rPr>
+      </w:pPr>
+      <w:r>
+        <w:rPr>
+          <w:rFonts w:ascii="Arial" w:hAnsi="Arial" w:cs="Arial"/>
+          <w:sz w:val="36"/>
+          <w:szCs w:val="36"/>
+        </w:rPr>
+        <w:t>One of the biggest mistakes I've seen students make with digital communication is sending super casual emails when applying for internships. I recently read about a situation where someone emailed a tech recruiter with a blank subject line and just wrote, "Here is my resume, let me know." Because there was no context or professional greeting, the recruiter’s email filter probably flagged it as spam, or they just deleted it. That student completely missed out on a career opportunity just because they didn't format their email properly.</w:t>
+      </w:r>
+    </w:p>
+    <w:p>
+      <w:pPr>
+        <w:rPr>
+          <w:rFonts w:ascii="Arial" w:hAnsi="Arial" w:cs="Arial"/>
+          <w:sz w:val="36"/>
+          <w:szCs w:val="36"/>
+        </w:rPr>
+      </w:pPr>
+      <w:r>
+        <w:rPr>
+          <w:rFonts w:ascii="Arial" w:hAnsi="Arial" w:cs="Arial"/>
+          <w:sz w:val="36"/>
+          <w:szCs w:val="36"/>
+        </w:rPr>
+        <w:t>It's such an easy fix, too. They should have used a clear subject line like "Software Engineering Internship Application," added a formal "Dear [Name]," briefly mentioned their skills, and ended with a proper sign-off. Taking that little bit of extra time guarantees your message actually gets taken seriously.</w:t>
+      </w:r>
+    </w:p>
+    <w:p>
+      <w:pPr>
+        <w:rPr>
+          <w:rFonts w:ascii="Arial" w:hAnsi="Arial" w:cs="Arial"/>
+          <w:sz w:val="28"/>
+          <w:szCs w:val="28"/>
+        </w:rPr>
+      </w:pPr>
+    </w:p>
+    <w:p>
+      <w:pPr>
+        <w:rPr>
+          <w:rFonts w:ascii="Arial" w:hAnsi="Arial" w:cs="Arial"/>
+          <w:sz w:val="40"/>
+          <w:szCs w:val="40"/>
+        </w:rPr>
+      </w:pPr>
+      <w:r>
+        <w:rPr>
+          <w:rFonts w:ascii="Arial" w:hAnsi="Arial" w:cs="Arial"/>
+          <w:b/>
+          <w:bCs/>
+          <w:sz w:val="40"/>
+          <w:szCs w:val="40"/>
+        </w:rPr>
+        <w:t>Task 5: Cybercrime Case Study</w:t>
+      </w:r>
+      <w:r>
+        <w:rPr>
+          <w:rFonts w:ascii="Arial" w:hAnsi="Arial" w:cs="Arial"/>
+          <w:sz w:val="40"/>
+          <w:szCs w:val="40"/>
+        </w:rPr>
+        <w:t xml:space="preserve"> </w:t>
+      </w:r>
+    </w:p>
+    <w:p>
+      <w:pPr>
+        <w:rPr>
+          <w:rFonts w:ascii="Arial" w:hAnsi="Arial" w:cs="Arial"/>
+          <w:sz w:val="36"/>
+          <w:szCs w:val="36"/>
+        </w:rPr>
+      </w:pPr>
+      <w:r>
+        <w:rPr>
+          <w:rFonts w:ascii="Arial" w:hAnsi="Arial" w:cs="Arial"/>
+          <w:sz w:val="36"/>
+          <w:szCs w:val="36"/>
+        </w:rPr>
+        <w:t>For this final task, I researched UPI payment frauds. The thing that surprised me most was how incredibly simple but psychologically effective the "QR code receive money" scam is. Even as a CSE student who builds web apps and understands how digital transactions work, it's easy to see how a scammer creating a fake sense of urgency could trick someone into entering their UPI PIN in a panic.</w:t>
+      </w:r>
+    </w:p>
+    <w:p>
+      <w:pPr>
+        <w:rPr>
+          <w:rFonts w:ascii="Arial" w:hAnsi="Arial" w:cs="Arial"/>
+          <w:sz w:val="36"/>
+          <w:szCs w:val="36"/>
+        </w:rPr>
+      </w:pPr>
+      <w:r>
+        <w:rPr>
+          <w:rFonts w:ascii="Arial" w:hAnsi="Arial" w:cs="Arial"/>
+          <w:sz w:val="36"/>
+          <w:szCs w:val="36"/>
+        </w:rPr>
+        <w:t>As a result of this research, I’m changing one major habit: I will completely stop relying on payment screenshots shown by other people. From now on, whether I'm splitting a bill at the canteen or selling an old textbook, I will only trust the actual credit notification from my own banking app.</w:t>
       </w:r>
     </w:p>
     <w:p>

</xml_diff>